<commit_message>
docs: add schema ER diagram to design doc
Figure 2 in the design doc, plus schema.md with the Mermaid source.

Co-Authored-By: Claude Haiku 5.5 <noreply@anthropic.com>
</commit_message>
<xml_diff>
--- a/design_doc/design.docx
+++ b/design_doc/design.docx
@@ -2592,6 +2592,68 @@
       </w:pPr>
       <w:r>
         <w:t xml:space="preserve">Resolved: seed.py creates test customers with emails (seed-customer-N@example.com, on a reserved domain). It is safe to rerun, because it skips emails that already exist.</w:t>
+      </w:r>
+    </w:p>
+    <w:p>
+      <w:pPr>
+        <w:pStyle w:val="Heading1"/>
+      </w:pPr>
+      <w:r>
+        <w:t xml:space="preserve">Schema (entity relationship diagram)</w:t>
+      </w:r>
+    </w:p>
+    <w:p>
+      <w:pPr>
+        <w:spacing w:after="120"/>
+        <w:jc w:val="center"/>
+      </w:pPr>
+      <w:r>
+        <w:drawing>
+          <wp:inline distT="0" distB="0" distL="0" distR="0">
+            <wp:extent cx="5943600" cy="5572125"/>
+            <wp:effectExtent t="0" r="0" b="0" l="0"/>
+            <wp:docPr id="101" name="schema_er" descr="Entity relationship diagram of staging and mart tables" title="Schema"/>
+            <wp:cNvGraphicFramePr>
+              <a:graphicFrameLocks xmlns:a="http://schemas.openxmlformats.org/drawingml/2006/main" noChangeAspect="1"/>
+            </wp:cNvGraphicFramePr>
+            <a:graphic xmlns:a="http://schemas.openxmlformats.org/drawingml/2006/main">
+              <a:graphicData uri="http://schemas.openxmlformats.org/drawingml/2006/picture">
+                <pic:pic xmlns:pic="http://schemas.openxmlformats.org/drawingml/2006/picture">
+                  <pic:nvPicPr>
+                    <pic:cNvPr id="0" name="schema_er.png" descr=""/>
+                    <pic:cNvPicPr>
+                      <a:picLocks noChangeAspect="1" noChangeArrowheads="1"/>
+                    </pic:cNvPicPr>
+                  </pic:nvPicPr>
+                  <pic:blipFill>
+                    <a:blip r:embed="rIdErSchema" cstate="none"/>
+                    <a:srcRect/>
+                    <a:stretch>
+                      <a:fillRect/>
+                    </a:stretch>
+                  </pic:blipFill>
+                  <pic:spPr bwMode="auto">
+                    <a:xfrm>
+                      <a:off x="0" y="0"/>
+                      <a:ext cx="5943600" cy="5572125"/>
+                    </a:xfrm>
+                    <a:prstGeom prst="rect">
+                      <a:avLst/>
+                    </a:prstGeom>
+                  </pic:spPr>
+                </pic:pic>
+              </a:graphicData>
+            </a:graphic>
+          </wp:inline>
+        </w:drawing>
+      </w:r>
+    </w:p>
+    <w:p>
+      <w:pPr>
+        <w:spacing w:after="120"/>
+      </w:pPr>
+      <w:r>
+        <w:t xml:space="preserve">Figure 2. Staging and mart tables and how they join. Personal fields are not in staging, so they do not appear. Source: design_doc/schema.md.</w:t>
       </w:r>
     </w:p>
     <w:p>

</xml_diff>

<commit_message>
docs: do not pin Java; users install their own JDK
- README asks for a JDK and says the pipeline was tested with Java 21 and 25.
- quickstart.sh points to the README when Java is missing.
- Design doc: Java version is not pinned; decided when the V2 workflow is built.
- Secrets file option is documented in README and design doc.

Co-Authored-By: Claude Haiku 5.5 <noreply@anthropic.com>
</commit_message>
<xml_diff>
--- a/design_doc/design.docx
+++ b/design_doc/design.docx
@@ -298,7 +298,7 @@
                 <w:sz w:val="20"/>
                 <w:szCs w:val="20"/>
               </w:rPr>
-              <w:t xml:space="preserve">Python 3.10+, uv, Java 21, a Stripe test key</w:t>
+              <w:t xml:space="preserve">Python 3.10+, uv, Java (any JDK that PySpark supports), a Stripe test key</w:t>
             </w:r>
           </w:p>
         </w:tc>
@@ -516,7 +516,7 @@
         <w:spacing w:after="120"/>
       </w:pPr>
       <w:r>
-        <w:t xml:space="preserve">PySpark is part of the minimum demo, so Java is a prerequisite for the first run. Java 21 is pinned for local and CI. PySpark 4.2.0 was smoke-tested on Java 21 and Java 25. The Java install is large; this is accepted.</w:t>
+        <w:t xml:space="preserve">PySpark is part of the minimum demo, so Java is a prerequisite for the first run. The Java version is not pinned, so each user installs a JDK (the README says how). PySpark 4.2.0 was smoke-tested on Java 21 and Java 25. The Java install is large; this is accepted.</w:t>
       </w:r>
     </w:p>
     <w:p>
@@ -1632,7 +1632,7 @@
         <w:spacing w:after="80"/>
       </w:pPr>
       <w:r>
-        <w:t xml:space="preserve">The secret test key (sk_test_...) is set per terminal session with read -s, as STRIPE_TEST_KEY. It is never written into a repo file.</w:t>
+        <w:t xml:space="preserve">The secret test key (sk_test_...) and PSEUDONYM_SALT are kept outside the repo. Locally they live in ~/.config/stripe-pipeline/secrets.env, a file readable only by the owner (mode 600). The quickstart script reads that file and refuses to run if the mode is wider. Alternatively, they can be exported in each terminal session. Neither value is ever written into a repo file.</w:t>
       </w:r>
     </w:p>
     <w:p>
@@ -4366,7 +4366,7 @@
         <w:spacing w:after="80"/>
       </w:pPr>
       <w:r>
-        <w:t xml:space="preserve">Decided: Java 21 for local and CI. PySpark is pinned to 4.2.0 in pyproject.toml and uv.lock.</w:t>
+        <w:t xml:space="preserve">Decided: PySpark is pinned to 4.2.0 in pyproject.toml and uv.lock. Java is not pinned yet. Users install their own JDK, and the workflow's Java version is decided when V2 is built.</w:t>
       </w:r>
     </w:p>
     <w:p>
@@ -4546,7 +4546,7 @@
         <w:spacing w:after="80"/>
       </w:pPr>
       <w:r>
-        <w:t xml:space="preserve">Quickstart (end of V1): on a new machine with Java 21, clone the repo, set STRIPE_TEST_KEY, and run one command from the README. Exit: the marts are produced, and the row counts match the counts documented in the README.</w:t>
+        <w:t xml:space="preserve">Quickstart (end of V1): on a new machine with Java installed, clone the repo, set STRIPE_TEST_KEY, and run one command from the README. Exit: the marts are produced, and the row counts match the counts documented in the README.</w:t>
       </w:r>
     </w:p>
     <w:p>
@@ -4559,7 +4559,7 @@
         <w:spacing w:after="80"/>
       </w:pPr>
       <w:r>
-        <w:t xml:space="preserve">V2 (orchestrated): Dagster assets with partitions, retries, and a UI; scheduled GitHub Actions with the stripe-test environment and concurrency group; incremental extract with checkpoints and an overlap window; warehouse restore from the previous artifact with a full-rebuild fallback; Java 21 installed in the workflow with a pinned setup-java action. Exit: a forced failure retries and shows in the Dagster UI; the second scheduled run is incremental; a run with an expired artifact falls back to a full rebuild and produces the same counts.</w:t>
+        <w:t xml:space="preserve">V2 (orchestrated): Dagster assets with partitions, retries, and a UI; scheduled GitHub Actions with the stripe-test environment and concurrency group; incremental extract with checkpoints and an overlap window; warehouse restore from the previous artifact with a full-rebuild fallback; Java installed in the workflow, with the version decided when the workflow is built. Exit: a forced failure retries and shows in the Dagster UI; the second scheduled run is incremental; a run with an expired artifact falls back to a full rebuild and produces the same counts.</w:t>
       </w:r>
     </w:p>
     <w:p>

</xml_diff>

<commit_message>
feat: incremental extract with checkpoints (V2 step 2)
- extract.py: first run, --full, and Sunday (UTC) pull everything; other runs
  pull changes since the checkpoint minus a one-day overlap. Checkpoints move
  forward only after every endpoint succeeds.
- Each run writes its own file, <endpoint>.<run time>.jsonl, so nothing is
  overwritten. The loader reads all files and keeps the newest copy of each id.
- flatten_items reads the full subscription list from the warehouse, so
  incremental runs still give complete output. Duplicate ids are checked per run file.
- Dagster extract uses the same module. Design doc and README updated.
- state/checkpoints.json tracks the last successful extract per endpoint.

Co-Authored-By: Claude Haiku 5.5 <noreply@anthropic.com>
</commit_message>
<xml_diff>
--- a/design_doc/design.docx
+++ b/design_doc/design.docx
@@ -1309,7 +1309,7 @@
         <w:spacing w:after="80"/>
       </w:pPr>
       <w:r>
-        <w:t xml:space="preserve">Each dt= folder holds one date. A rerun on the same day overwrites that day's raw files, which is accepted. Loads stay correct because the warehouse upserts by id.</w:t>
+        <w:t xml:space="preserve">Each dt= folder holds every run for that date. Each run writes its own file, named with its run time, such as subscriptions.20261014T235333Z.jsonl, so nothing is overwritten. The loader reads all files and keeps the newest copy of each id.</w:t>
       </w:r>
     </w:p>
     <w:p>
@@ -3433,7 +3433,7 @@
         <w:spacing w:after="80"/>
       </w:pPr>
       <w:r>
-        <w:t xml:space="preserve">Subscription items (V1): the subscriptions endpoint returns each subscription with its items embedded (items.data, items.has_more). The flatten step reads them from the raw subscriptions file, so no extra API calls are needed. If items.has_more is true for any subscription, the flatten step fails and names the subscription, so an incomplete list is never written silently. A per-subscription fetch of the subscription items endpoint is added only if that failure happens with real data.</w:t>
+        <w:t xml:space="preserve">Subscription items (V1): the subscriptions endpoint returns each subscription with its items embedded (items.data, items.has_more). The flatten step reads them from the warehouse's subscription list, which holds every subscription, so no extra API calls are needed. If items.has_more is true for any subscription, the flatten step fails and names the subscription, so an incomplete list is never written silently. A per-subscription fetch of the subscription items endpoint is added only if that failure happens with real data.</w:t>
       </w:r>
     </w:p>
     <w:p>
@@ -3577,7 +3577,7 @@
         <w:spacing w:after="80"/>
       </w:pPr>
       <w:r>
-        <w:t xml:space="preserve">Raw files are written to a folder per run date (see Repository layout). A rerun on the same day overwrites that day's files. Earlier days are never touched, so each day can still be replayed or audited on its own.</w:t>
+        <w:t xml:space="preserve">Raw files are written to a folder per run date (see Repository layout). Each run adds a file to that folder, and nothing is overwritten. Earlier days are never touched, so each day can still be replayed or audited on its own.</w:t>
       </w:r>
     </w:p>
     <w:p>
@@ -4194,7 +4194,7 @@
         <w:spacing w:after="80"/>
       </w:pPr>
       <w:r>
-        <w:t xml:space="preserve">Flatten (V1): a PySpark script (flatten_items.py) reads the raw subscriptions file. It stops, naming each duplicated subscription id and its count, if any id appears more than once. It also stops if any items.has_more is set. Otherwise it takes the embedded items and writes Parquet. When it stops, it writes nothing.</w:t>
+        <w:t xml:space="preserve">Flatten (V1): a PySpark script (flatten_items.py) reads the full subscription list from the warehouse, so incremental runs still give a complete result. It stops, naming each duplicated id and its count, if any run file repeats an id. It also stops if any items.has_more is set. Otherwise it takes the embedded items and writes Parquet. When it stops, it writes nothing.</w:t>
       </w:r>
     </w:p>
     <w:p>

</xml_diff>

<commit_message>
feat: public dashboard, PII masking, snapshot staging fix (V3)
- Public marts tagged 'public'. public_export copies them to data/public/public.duckdb.
- build_site writes one static HTML page from that database only (inline SVG).
- dbt guard test fails if a public model has a personal column, checked against
  the warehouse columns and the pii tags.
- Pages deploy job in the workflow, skipped while the repo is private.
- load.py masks personal fields before the warehouse is saved: names and phones
  masked, address lines removed (country kept), emails and card details removed.
  customer_keys are computed from the raw email first and only upserted.
- stg_subscription_items reads only the newest snapshot, not every date folder.
- mart_mrr adds mrr_major and decimal_places.
- Design doc, diagram, README, and quickstart updated.

Co-Authored-By: Claude Haiku 5.5 <noreply@anthropic.com>
</commit_message>
<xml_diff>
--- a/design_doc/design.docx
+++ b/design_doc/design.docx
@@ -366,7 +366,7 @@
                 <w:sz w:val="20"/>
                 <w:szCs w:val="20"/>
               </w:rPr>
-              <w:t xml:space="preserve">Adds Dagster, GitHub Actions schedule, incremental loads, Evidence dashboard on GitHub Pages.</w:t>
+              <w:t xml:space="preserve">Adds Dagster, GitHub Actions schedule, incremental loads, and a static dashboard page built from public marts.</w:t>
             </w:r>
           </w:p>
         </w:tc>
@@ -388,7 +388,7 @@
                 <w:sz w:val="20"/>
                 <w:szCs w:val="20"/>
               </w:rPr>
-              <w:t xml:space="preserve">A GitHub account with Actions and Pages; Node.js for Evidence</w:t>
+              <w:t xml:space="preserve">A GitHub account with Actions. GitHub Pages on a private repo needs a paid plan.</w:t>
             </w:r>
           </w:p>
         </w:tc>
@@ -1119,7 +1119,7 @@
                 <w:sz w:val="20"/>
                 <w:szCs w:val="20"/>
               </w:rPr>
-              <w:t xml:space="preserve">dashboard/</w:t>
+              <w:t xml:space="preserve">data/site/</w:t>
             </w:r>
           </w:p>
         </w:tc>
@@ -1141,7 +1141,7 @@
                 <w:sz w:val="20"/>
                 <w:szCs w:val="20"/>
               </w:rPr>
-              <w:t xml:space="preserve">Evidence project (V3)</w:t>
+              <w:t xml:space="preserve">Static dashboard page built from public marts (V3)</w:t>
             </w:r>
           </w:p>
         </w:tc>
@@ -1163,7 +1163,7 @@
                 <w:sz w:val="20"/>
                 <w:szCs w:val="20"/>
               </w:rPr>
-              <w:t xml:space="preserve">Markdown and SQL</w:t>
+              <w:t xml:space="preserve">HTML and Python-generated SVG</w:t>
             </w:r>
           </w:p>
         </w:tc>
@@ -1786,7 +1786,7 @@
         <w:spacing w:after="120"/>
       </w:pPr>
       <w:r>
-        <w:t xml:space="preserve">Test data is synthetic, but the design treats the data as real. The table lists the personal fields in these endpoints and how each is handled.</w:t>
+        <w:t xml:space="preserve">Test data is synthetic, but the design treats the data as real. Decided for test data only: when the warehouse is saved, name and phone are masked (the first letter of the name, and the last two digits of the phone), and address lines are removed, keeping only the country. Emails are already replaced by customer_key. Masking is weaker than keyed hashing, because masked values can still narrow down a person. This is acceptable only because the data is test data. Before any real customer data is loaded, this decision must be revisited, and keyed hashing or removal must replace masking. The masking is implemented in the loader (mask_personal in load.py), so the warehouse holds masked values only. The customer_key is computed from the raw email first, and it is kept in customer_keys, which is only upserted. The table lists the personal fields in these endpoints and how each is handled.</w:t>
       </w:r>
     </w:p>
     <w:tbl>
@@ -2507,7 +2507,7 @@
         <w:spacing w:after="80"/>
       </w:pPr>
       <w:r>
-        <w:t xml:space="preserve">Public site uses aggregates only. The Evidence dashboard (V3) reads only models tagged public, which are aggregates by month, plan, and currency. No row-level customer data appears on GitHub Pages.</w:t>
+        <w:t xml:space="preserve">Public site uses aggregates only. The dashboard (V3) reads only a separate database that holds the models tagged public, which are aggregates by month, plan, and currency. No row-level customer data appears on GitHub Pages.</w:t>
       </w:r>
     </w:p>
     <w:p>
@@ -2520,7 +2520,7 @@
         <w:spacing w:after="80"/>
       </w:pPr>
       <w:r>
-        <w:t xml:space="preserve">Enforce it in tests. Tag personal columns in dbt (meta: pii: true). A dbt test fails if a public model contains any pii column, so a future change cannot publish personal data silently.</w:t>
+        <w:t xml:space="preserve">Enforce it in tests. Tag personal columns in dbt (meta: pii: true). A dbt test fails if a public model has a column tagged pii, or a personal column name in the warehouse, even when the column was added without a tag, so a future change cannot publish personal data silently.</w:t>
       </w:r>
     </w:p>
     <w:p>
@@ -4194,7 +4194,7 @@
         <w:spacing w:after="80"/>
       </w:pPr>
       <w:r>
-        <w:t xml:space="preserve">Flatten (V1): a PySpark script (flatten_items.py) reads the full subscription list from the warehouse, so incremental runs still give a complete result. It stops, naming each duplicated id and its count, if any run file repeats an id. It also stops if any items.has_more is set. Otherwise it takes the embedded items and writes Parquet. When it stops, it writes nothing.</w:t>
+        <w:t xml:space="preserve">Flatten (V1): a PySpark script (flatten_items.py) reads the full subscription list from the warehouse, so incremental runs still give a complete result. It stops, naming each duplicated id and its count, if any run file repeats an id. It also stops if any items.has_more is set. Otherwise it takes the embedded items and writes Parquet. When it stops, it writes nothing. Staging reads only the newest date folder, because each folder is a full snapshot of all items.</w:t>
       </w:r>
     </w:p>
     <w:p>
@@ -4233,7 +4233,7 @@
         <w:spacing w:after="80"/>
       </w:pPr>
       <w:r>
-        <w:t xml:space="preserve">Publish (V3): Evidence builds a static dashboard from public marts only and publishes it to GitHub Pages.</w:t>
+        <w:t xml:space="preserve">Publish (V3): a Python script builds a static HTML page from public marts only. The public marts are copied into their own database first, and the page reads only that. The workflow publishes it to GitHub Pages through a deploy job, which is skipped while the repository is private.</w:t>
       </w:r>
     </w:p>
     <w:p>
@@ -4572,7 +4572,7 @@
         <w:spacing w:after="80"/>
       </w:pPr>
       <w:r>
-        <w:t xml:space="preserve">V3 (published): Evidence dashboard on GitHub Pages from public marts only; dbt PII guard test; README on rebuilding. Exit: the page updates after a scheduled run, and the guard test fails when a personal column is added to a public model.</w:t>
+        <w:t xml:space="preserve">V3 (published): static dashboard page from public marts only, published to GitHub Pages by the workflow once the repository is public; dbt PII guard test; README on rebuilding. Exit: the page updates after a scheduled run, and the guard test fails when a personal column is added to a public model.</w:t>
       </w:r>
     </w:p>
     <w:p>

</xml_diff>

<commit_message>
docs: describe bronze, silver, and gold layers and how to view each
- Design doc: new section defining the three layers, and bronze/silver/gold
  labels on the repository layout table.
- README: Viewing the layers section with one command per layer.

Co-Authored-By: Claude Haiku 5.5 <noreply@anthropic.com>
</commit_message>
<xml_diff>
--- a/design_doc/design.docx
+++ b/design_doc/design.docx
@@ -524,6 +524,39 @@
         <w:pStyle w:val="Heading1"/>
       </w:pPr>
       <w:r>
+        <w:t xml:space="preserve">Data layers (bronze, silver, gold)</w:t>
+      </w:r>
+    </w:p>
+    <w:p>
+      <w:r>
+        <w:t xml:space="preserve">The pipeline follows the bronze, silver, and gold layering. Each layer has one job, and each builds on the one before it.</w:t>
+      </w:r>
+    </w:p>
+    <w:p>
+      <w:r>
+        <w:t xml:space="preserve">Bronze (raw): the data as Stripe sent it, one JSON object per line in data/raw/&lt;endpoint&gt;/dt=&lt;date&gt;/, kept for 7 days. In the warehouse, the raw_&lt;endpoint&gt; tables hold the same objects as text, with personal fields masked (see Personal data and privacy).</w:t>
+      </w:r>
+    </w:p>
+    <w:p>
+      <w:r>
+        <w:t xml:space="preserve">Silver (cleaned): staging views (stg_*) keep only allowlisted fields, with typed columns, UTC timestamps, and customer_key. Subscription items are also written as Parquet in data/silver/subscription_items/, with one folder per run date.</w:t>
+      </w:r>
+    </w:p>
+    <w:p>
+      <w:r>
+        <w:t xml:space="preserve">Gold (business): fct_subscription_items and the mart_* tables, which answer the business questions: MRR, active subscriptions, revenue, and cancellations. The tables tagged public are copied to data/public/public.duckdb for the dashboard.</w:t>
+      </w:r>
+    </w:p>
+    <w:p>
+      <w:r>
+        <w:t xml:space="preserve">To see each layer, see Viewing the layers in the README.</w:t>
+      </w:r>
+    </w:p>
+    <w:p>
+      <w:pPr>
+        <w:pStyle w:val="Heading1"/>
+      </w:pPr>
+      <w:r>
         <w:t xml:space="preserve">Repository layout and output paths</w:t>
       </w:r>
     </w:p>
@@ -691,7 +724,7 @@
                 <w:sz w:val="20"/>
                 <w:szCs w:val="20"/>
               </w:rPr>
-              <w:t xml:space="preserve">Raw Stripe objects from one run, personal fields included</w:t>
+              <w:t xml:space="preserve">Bronze. Raw Stripe objects from one run, personal fields included</w:t>
             </w:r>
           </w:p>
         </w:tc>
@@ -781,7 +814,7 @@
                 <w:sz w:val="20"/>
                 <w:szCs w:val="20"/>
               </w:rPr>
-              <w:t xml:space="preserve">Flattened subscription items</w:t>
+              <w:t xml:space="preserve">Silver. Flattened subscription items</w:t>
             </w:r>
           </w:p>
         </w:tc>
@@ -871,7 +904,7 @@
                 <w:sz w:val="20"/>
                 <w:szCs w:val="20"/>
               </w:rPr>
-              <w:t xml:space="preserve">Raw tables, staging, and marts</w:t>
+              <w:t xml:space="preserve">Bronze (raw tables), silver (staging), and gold (marts)</w:t>
             </w:r>
           </w:p>
         </w:tc>
@@ -961,7 +994,7 @@
                 <w:sz w:val="20"/>
                 <w:szCs w:val="20"/>
               </w:rPr>
-              <w:t xml:space="preserve">Last successful extract time per endpoint (V2)</w:t>
+              <w:t xml:space="preserve">Not a data layer. Last successful extract time per endpoint (V2)</w:t>
             </w:r>
           </w:p>
         </w:tc>
@@ -1051,7 +1084,7 @@
                 <w:sz w:val="20"/>
                 <w:szCs w:val="20"/>
               </w:rPr>
-              <w:t xml:space="preserve">dbt project: models, seeds, macros, tests, and the project files (dbt_project.yml, profiles.yml)</w:t>
+              <w:t xml:space="preserve">Not a data layer. Code that builds the silver and gold models: dbt project with models, seeds, macros, tests, and the project files (dbt_project.yml, profiles.yml)</w:t>
             </w:r>
           </w:p>
         </w:tc>
@@ -1141,7 +1174,7 @@
                 <w:sz w:val="20"/>
                 <w:szCs w:val="20"/>
               </w:rPr>
-              <w:t xml:space="preserve">Static dashboard page built from public marts (V3)</w:t>
+              <w:t xml:space="preserve">Gold, public copy. Static dashboard page built from public marts (V3)</w:t>
             </w:r>
           </w:p>
         </w:tc>
@@ -1231,7 +1264,7 @@
                 <w:sz w:val="20"/>
                 <w:szCs w:val="20"/>
               </w:rPr>
-              <w:t xml:space="preserve">Job definition, Dagster assets, workflow</w:t>
+              <w:t xml:space="preserve">Not a data layer. Job definition, Dagster assets, workflow</w:t>
             </w:r>
           </w:p>
         </w:tc>

</xml_diff>

<commit_message>
feat: pii meta tags on personal columns; mart tables in the schema diagram
- dbt schema: meta pii tags on customer_id, customer_key, and country in staging,
  and on customer_id in the fact table. The public-model guard reads these tags.
- Schema diagram and design doc picture now include the four gold mart tables.

Co-Authored-By: Claude Haiku 5.5 <noreply@anthropic.com>
</commit_message>
<xml_diff>
--- a/design_doc/design.docx
+++ b/design_doc/design.docx
@@ -58,7 +58,7 @@
       <w:r>
         <w:drawing>
           <wp:inline distT="0" distB="0" distL="0" distR="0">
-            <wp:extent cx="5943600" cy="3181350"/>
+            <wp:extent cx="5943600" cy="6049735"/>
             <wp:effectExtent t="0" r="0" b="0" l="0"/>
             <wp:docPr id="1" name="" descr="" title=""/>
             <wp:cNvGraphicFramePr>
@@ -2643,7 +2643,7 @@
       <w:r>
         <w:drawing>
           <wp:inline distT="0" distB="0" distL="0" distR="0">
-            <wp:extent cx="5943600" cy="5572125"/>
+            <wp:extent cx="5943600" cy="6049735"/>
             <wp:effectExtent t="0" r="0" b="0" l="0"/>
             <wp:docPr id="101" name="schema_er" descr="Entity relationship diagram of staging and mart tables" title="Schema"/>
             <wp:cNvGraphicFramePr>
@@ -2668,7 +2668,7 @@
                   <pic:spPr bwMode="auto">
                     <a:xfrm>
                       <a:off x="0" y="0"/>
-                      <a:ext cx="5943600" cy="5572125"/>
+                      <a:ext cx="5943600" cy="6049735"/>
                     </a:xfrm>
                     <a:prstGeom prst="rect">
                       <a:avLst/>

</xml_diff>

<commit_message>
docs: V4 status and authentication decision in the design doc
Records the personal access token decision, that S3 is not used, and the
V4 status: dbt build passes on Databricks and the dashboard matches the
DuckDB marts.

Co-Authored-By: Claude Haiku 5.5 <noreply@anthropic.com>
</commit_message>
<xml_diff>
--- a/design_doc/design.docx
+++ b/design_doc/design.docx
@@ -4425,7 +4425,7 @@
         <w:spacing w:after="80"/>
       </w:pPr>
       <w:r>
-        <w:t xml:space="preserve">Databricks (V4): the same PySpark and dbt code on Databricks Free Edition with Delta tables. Authentication to be decided (for example OAuth service principal, or Free Edition's own login).</w:t>
+        <w:t>Databricks (V4): the same PySpark and dbt code on Databricks Free Edition with Delta tables. Decided: log in with a personal access token, kept in the environment variable DATABRICKS_TOKEN and never in the repo. Renew it before its 90-day expiry. A service principal is not used, because Free Edition has no account-level API access.</w:t>
       </w:r>
     </w:p>
     <w:p>
@@ -4618,7 +4618,7 @@
         <w:spacing w:after="80"/>
       </w:pPr>
       <w:r>
-        <w:t xml:space="preserve">V4 (optional cloud demo): the same PySpark job runs on Databricks Free Edition, writing Delta tables, with the dbt models and a Databricks SQL dashboard. Exit: dbt tests pass on Databricks, and the dashboard numbers match the DuckDB marts. Needs a Databricks account.</w:t>
+        <w:t>V4 (optional cloud demo): the same PySpark job runs on Databricks Free Edition, writing Delta tables, with the dbt models and a Databricks SQL dashboard. Exit: dbt tests pass on Databricks, and the dashboard numbers match the DuckDB marts. Needs a Databricks account. Status: dbt build passes on Databricks (45 tests), and the dashboard figures match the DuckDB marts. The dashboard is an AI/BI dashboard on the four marts. Data is loaded by hand from a masked Parquet export (export_databricks) into Unity Catalog tables, not on a schedule. Free Edition does not support custom storage locations, so S3 is not used.</w:t>
       </w:r>
     </w:p>
     <w:sectPr>

</xml_diff>

<commit_message>
docs: note the daily test-invoice workflow in the design doc
Co-Authored-By: Claude Haiku 5.5 <noreply@anthropic.com>
</commit_message>
<xml_diff>
--- a/design_doc/design.docx
+++ b/design_doc/design.docx
@@ -3556,6 +3556,19 @@
       </w:pPr>
       <w:r>
         <w:t xml:space="preserve">Warehouse (V2): each run restores data/warehouse/warehouse.duckdb from the previous run's artifact for incremental loads. If the artifact has expired, the run does a full rebuild from Stripe. The run log records which path it took.</w:t>
+      </w:r>
+    </w:p>
+    <w:p>
+      <w:pPr>
+        <w:pStyle w:val="ListParagraph"/>
+        <w:numPr>
+          <w:ilvl w:val="0"/>
+          <w:numId w:val="2"/>
+        </w:numPr>
+        <w:spacing w:after="80"/>
+      </w:pPr>
+      <w:r>
+        <w:t>Test data (V3 dashboard): a separate workflow, test-invoice, creates one paid test invoice a day in the Stripe test account, half an hour before the pipeline, so the dashboard gets a new day. It is the only job that writes to Stripe. The pipeline itself stays read-only, and the script refuses any key that is not a test-mode key.</w:t>
       </w:r>
     </w:p>
     <w:p>

</xml_diff>